<commit_message>
docs(nt532): refresh portable release evidence
</commit_message>
<xml_diff>
--- a/deliverables/BAO-CAO-NT532-MQTT-MVP.docx
+++ b/deliverables/BAO-CAO-NT532-MQTT-MVP.docx
@@ -11,7 +11,7 @@
           <w:noProof/>
         </w:rPr>
         <w:drawing>
-          <wp:anchor distT="0" distB="0" distL="0" distR="0" simplePos="0" relativeHeight="251658240" behindDoc="1" locked="0" layoutInCell="1" allowOverlap="1" wp14:anchorId="26703D7E" wp14:editId="3AF3C4D8">
+          <wp:anchor distT="0" distB="0" distL="0" distR="0" simplePos="0" relativeHeight="251658240" behindDoc="1" locked="0" layoutInCell="1" allowOverlap="1" wp14:anchorId="0F2B8ED7" wp14:editId="1513816F">
             <wp:simplePos x="0" y="0"/>
             <wp:positionH relativeFrom="page">
               <wp:posOffset>429768</wp:posOffset>
@@ -107,7 +107,7 @@
           <w:noProof/>
         </w:rPr>
         <w:drawing>
-          <wp:inline distT="0" distB="0" distL="0" distR="0" wp14:anchorId="34D3638B" wp14:editId="2C9E9381">
+          <wp:inline distT="0" distB="0" distL="0" distR="0" wp14:anchorId="28594310" wp14:editId="036E7816">
             <wp:extent cx="1444752" cy="1105275"/>
             <wp:effectExtent l="0" t="0" r="0" b="0"/>
             <wp:docPr id="2" name="Logo UIT" descr="Logo Trường Đại học Công nghệ Thông tin, ĐHQG-HCM."/>
@@ -359,7 +359,7 @@
       <w:pPr>
         <w:pStyle w:val="Heading1"/>
       </w:pPr>
-      <w:bookmarkStart w:id="0" w:name="_Toc237591173"/>
+      <w:bookmarkStart w:id="0" w:name="_Toc237591714"/>
       <w:r>
         <w:lastRenderedPageBreak/>
         <w:t>M</w:t>
@@ -403,7 +403,7 @@
       <w:r>
         <w:fldChar w:fldCharType="separate"/>
       </w:r>
-      <w:hyperlink w:anchor="_Toc237591173" w:history="1">
+      <w:hyperlink w:anchor="_Toc237591714" w:history="1">
         <w:r>
           <w:rPr>
             <w:rStyle w:val="Hyperlink"/>
@@ -430,7 +430,7 @@
             <w:noProof/>
             <w:webHidden/>
           </w:rPr>
-          <w:instrText xml:space="preserve"> PAGEREF _Toc237591173 \h </w:instrText>
+          <w:instrText xml:space="preserve"> PAGEREF _Toc237591714 \h </w:instrText>
         </w:r>
         <w:r>
           <w:rPr>
@@ -477,7 +477,7 @@
           <w14:ligatures w14:val="standardContextual"/>
         </w:rPr>
       </w:pPr>
-      <w:hyperlink w:anchor="_Toc237591174" w:history="1">
+      <w:hyperlink w:anchor="_Toc237591715" w:history="1">
         <w:r>
           <w:rPr>
             <w:rStyle w:val="Hyperlink"/>
@@ -504,7 +504,7 @@
             <w:noProof/>
             <w:webHidden/>
           </w:rPr>
-          <w:instrText xml:space="preserve"> PAGEREF _Toc237591174 \h </w:instrText>
+          <w:instrText xml:space="preserve"> PAGEREF _Toc237591715 \h </w:instrText>
         </w:r>
         <w:r>
           <w:rPr>
@@ -551,7 +551,7 @@
           <w14:ligatures w14:val="standardContextual"/>
         </w:rPr>
       </w:pPr>
-      <w:hyperlink w:anchor="_Toc237591175" w:history="1">
+      <w:hyperlink w:anchor="_Toc237591716" w:history="1">
         <w:r>
           <w:rPr>
             <w:rStyle w:val="Hyperlink"/>
@@ -578,7 +578,7 @@
             <w:noProof/>
             <w:webHidden/>
           </w:rPr>
-          <w:instrText xml:space="preserve"> PAGEREF _Toc237591175 \h </w:instrText>
+          <w:instrText xml:space="preserve"> PAGEREF _Toc237591716 \h </w:instrText>
         </w:r>
         <w:r>
           <w:rPr>
@@ -625,7 +625,7 @@
           <w14:ligatures w14:val="standardContextual"/>
         </w:rPr>
       </w:pPr>
-      <w:hyperlink w:anchor="_Toc237591176" w:history="1">
+      <w:hyperlink w:anchor="_Toc237591717" w:history="1">
         <w:r>
           <w:rPr>
             <w:rStyle w:val="Hyperlink"/>
@@ -652,7 +652,7 @@
             <w:noProof/>
             <w:webHidden/>
           </w:rPr>
-          <w:instrText xml:space="preserve"> PAGEREF _Toc237591176 \h </w:instrText>
+          <w:instrText xml:space="preserve"> PAGEREF _Toc237591717 \h </w:instrText>
         </w:r>
         <w:r>
           <w:rPr>
@@ -699,7 +699,7 @@
           <w14:ligatures w14:val="standardContextual"/>
         </w:rPr>
       </w:pPr>
-      <w:hyperlink w:anchor="_Toc237591177" w:history="1">
+      <w:hyperlink w:anchor="_Toc237591718" w:history="1">
         <w:r>
           <w:rPr>
             <w:rStyle w:val="Hyperlink"/>
@@ -726,7 +726,7 @@
             <w:noProof/>
             <w:webHidden/>
           </w:rPr>
-          <w:instrText xml:space="preserve"> PAGEREF _Toc237591177 \h </w:instrText>
+          <w:instrText xml:space="preserve"> PAGEREF _Toc237591718 \h </w:instrText>
         </w:r>
         <w:r>
           <w:rPr>
@@ -773,7 +773,7 @@
           <w14:ligatures w14:val="standardContextual"/>
         </w:rPr>
       </w:pPr>
-      <w:hyperlink w:anchor="_Toc237591178" w:history="1">
+      <w:hyperlink w:anchor="_Toc237591719" w:history="1">
         <w:r>
           <w:rPr>
             <w:rStyle w:val="Hyperlink"/>
@@ -800,7 +800,7 @@
             <w:noProof/>
             <w:webHidden/>
           </w:rPr>
-          <w:instrText xml:space="preserve"> PAGEREF _Toc237591178 \h </w:instrText>
+          <w:instrText xml:space="preserve"> PAGEREF _Toc237591719 \h </w:instrText>
         </w:r>
         <w:r>
           <w:rPr>
@@ -847,7 +847,7 @@
           <w14:ligatures w14:val="standardContextual"/>
         </w:rPr>
       </w:pPr>
-      <w:hyperlink w:anchor="_Toc237591179" w:history="1">
+      <w:hyperlink w:anchor="_Toc237591720" w:history="1">
         <w:r>
           <w:rPr>
             <w:rStyle w:val="Hyperlink"/>
@@ -874,7 +874,7 @@
             <w:noProof/>
             <w:webHidden/>
           </w:rPr>
-          <w:instrText xml:space="preserve"> PAGEREF _Toc237591179 \h </w:instrText>
+          <w:instrText xml:space="preserve"> PAGEREF _Toc237591720 \h </w:instrText>
         </w:r>
         <w:r>
           <w:rPr>
@@ -921,7 +921,7 @@
           <w14:ligatures w14:val="standardContextual"/>
         </w:rPr>
       </w:pPr>
-      <w:hyperlink w:anchor="_Toc237591180" w:history="1">
+      <w:hyperlink w:anchor="_Toc237591721" w:history="1">
         <w:r>
           <w:rPr>
             <w:rStyle w:val="Hyperlink"/>
@@ -948,7 +948,7 @@
             <w:noProof/>
             <w:webHidden/>
           </w:rPr>
-          <w:instrText xml:space="preserve"> PAGEREF _Toc237591180 \h </w:instrText>
+          <w:instrText xml:space="preserve"> PAGEREF _Toc237591721 \h </w:instrText>
         </w:r>
         <w:r>
           <w:rPr>
@@ -995,7 +995,7 @@
           <w14:ligatures w14:val="standardContextual"/>
         </w:rPr>
       </w:pPr>
-      <w:hyperlink w:anchor="_Toc237591181" w:history="1">
+      <w:hyperlink w:anchor="_Toc237591722" w:history="1">
         <w:r>
           <w:rPr>
             <w:rStyle w:val="Hyperlink"/>
@@ -1022,7 +1022,7 @@
             <w:noProof/>
             <w:webHidden/>
           </w:rPr>
-          <w:instrText xml:space="preserve"> PAGEREF _Toc237591181 \h </w:instrText>
+          <w:instrText xml:space="preserve"> PAGEREF _Toc237591722 \h </w:instrText>
         </w:r>
         <w:r>
           <w:rPr>
@@ -1069,7 +1069,7 @@
           <w14:ligatures w14:val="standardContextual"/>
         </w:rPr>
       </w:pPr>
-      <w:hyperlink w:anchor="_Toc237591182" w:history="1">
+      <w:hyperlink w:anchor="_Toc237591723" w:history="1">
         <w:r>
           <w:rPr>
             <w:rStyle w:val="Hyperlink"/>
@@ -1096,7 +1096,7 @@
             <w:noProof/>
             <w:webHidden/>
           </w:rPr>
-          <w:instrText xml:space="preserve"> PAGEREF _Toc237591182 \h </w:instrText>
+          <w:instrText xml:space="preserve"> PAGEREF _Toc237591723 \h </w:instrText>
         </w:r>
         <w:r>
           <w:rPr>
@@ -1143,7 +1143,7 @@
           <w14:ligatures w14:val="standardContextual"/>
         </w:rPr>
       </w:pPr>
-      <w:hyperlink w:anchor="_Toc237591183" w:history="1">
+      <w:hyperlink w:anchor="_Toc237591724" w:history="1">
         <w:r>
           <w:rPr>
             <w:rStyle w:val="Hyperlink"/>
@@ -1170,7 +1170,7 @@
             <w:noProof/>
             <w:webHidden/>
           </w:rPr>
-          <w:instrText xml:space="preserve"> PAGEREF _Toc237591183 \h </w:instrText>
+          <w:instrText xml:space="preserve"> PAGEREF _Toc237591724 \h </w:instrText>
         </w:r>
         <w:r>
           <w:rPr>
@@ -1217,7 +1217,7 @@
           <w14:ligatures w14:val="standardContextual"/>
         </w:rPr>
       </w:pPr>
-      <w:hyperlink w:anchor="_Toc237591184" w:history="1">
+      <w:hyperlink w:anchor="_Toc237591725" w:history="1">
         <w:r>
           <w:rPr>
             <w:rStyle w:val="Hyperlink"/>
@@ -1244,7 +1244,7 @@
             <w:noProof/>
             <w:webHidden/>
           </w:rPr>
-          <w:instrText xml:space="preserve"> PAGEREF _Toc237591184 \h </w:instrText>
+          <w:instrText xml:space="preserve"> PAGEREF _Toc237591725 \h </w:instrText>
         </w:r>
         <w:r>
           <w:rPr>
@@ -1291,7 +1291,7 @@
           <w14:ligatures w14:val="standardContextual"/>
         </w:rPr>
       </w:pPr>
-      <w:hyperlink w:anchor="_Toc237591185" w:history="1">
+      <w:hyperlink w:anchor="_Toc237591726" w:history="1">
         <w:r>
           <w:rPr>
             <w:rStyle w:val="Hyperlink"/>
@@ -1318,7 +1318,7 @@
             <w:noProof/>
             <w:webHidden/>
           </w:rPr>
-          <w:instrText xml:space="preserve"> PAGEREF _Toc237591185 \h </w:instrText>
+          <w:instrText xml:space="preserve"> PAGEREF _Toc237591726 \h </w:instrText>
         </w:r>
         <w:r>
           <w:rPr>
@@ -1365,7 +1365,7 @@
           <w14:ligatures w14:val="standardContextual"/>
         </w:rPr>
       </w:pPr>
-      <w:hyperlink w:anchor="_Toc237591186" w:history="1">
+      <w:hyperlink w:anchor="_Toc237591727" w:history="1">
         <w:r>
           <w:rPr>
             <w:rStyle w:val="Hyperlink"/>
@@ -1392,7 +1392,7 @@
             <w:noProof/>
             <w:webHidden/>
           </w:rPr>
-          <w:instrText xml:space="preserve"> PAGEREF _Toc237591186 \h </w:instrText>
+          <w:instrText xml:space="preserve"> PAGEREF _Toc237591727 \h </w:instrText>
         </w:r>
         <w:r>
           <w:rPr>
@@ -1439,7 +1439,7 @@
           <w14:ligatures w14:val="standardContextual"/>
         </w:rPr>
       </w:pPr>
-      <w:hyperlink w:anchor="_Toc237591187" w:history="1">
+      <w:hyperlink w:anchor="_Toc237591728" w:history="1">
         <w:r>
           <w:rPr>
             <w:rStyle w:val="Hyperlink"/>
@@ -1466,7 +1466,7 @@
             <w:noProof/>
             <w:webHidden/>
           </w:rPr>
-          <w:instrText xml:space="preserve"> PAGEREF _Toc237591187 \h </w:instrText>
+          <w:instrText xml:space="preserve"> PAGEREF _Toc237591728 \h </w:instrText>
         </w:r>
         <w:r>
           <w:rPr>
@@ -1513,7 +1513,7 @@
           <w14:ligatures w14:val="standardContextual"/>
         </w:rPr>
       </w:pPr>
-      <w:hyperlink w:anchor="_Toc237591188" w:history="1">
+      <w:hyperlink w:anchor="_Toc237591729" w:history="1">
         <w:r>
           <w:rPr>
             <w:rStyle w:val="Hyperlink"/>
@@ -1540,7 +1540,7 @@
             <w:noProof/>
             <w:webHidden/>
           </w:rPr>
-          <w:instrText xml:space="preserve"> PAGEREF _Toc237591188 \h </w:instrText>
+          <w:instrText xml:space="preserve"> PAGEREF _Toc237591729 \h </w:instrText>
         </w:r>
         <w:r>
           <w:rPr>
@@ -1587,7 +1587,7 @@
           <w14:ligatures w14:val="standardContextual"/>
         </w:rPr>
       </w:pPr>
-      <w:hyperlink w:anchor="_Toc237591189" w:history="1">
+      <w:hyperlink w:anchor="_Toc237591730" w:history="1">
         <w:r>
           <w:rPr>
             <w:rStyle w:val="Hyperlink"/>
@@ -1614,7 +1614,7 @@
             <w:noProof/>
             <w:webHidden/>
           </w:rPr>
-          <w:instrText xml:space="preserve"> PAGEREF _Toc237591189 \h </w:instrText>
+          <w:instrText xml:space="preserve"> PAGEREF _Toc237591730 \h </w:instrText>
         </w:r>
         <w:r>
           <w:rPr>
@@ -1661,7 +1661,7 @@
           <w14:ligatures w14:val="standardContextual"/>
         </w:rPr>
       </w:pPr>
-      <w:hyperlink w:anchor="_Toc237591190" w:history="1">
+      <w:hyperlink w:anchor="_Toc237591731" w:history="1">
         <w:r>
           <w:rPr>
             <w:rStyle w:val="Hyperlink"/>
@@ -1688,7 +1688,7 @@
             <w:noProof/>
             <w:webHidden/>
           </w:rPr>
-          <w:instrText xml:space="preserve"> PAGEREF _Toc237591190 \h </w:instrText>
+          <w:instrText xml:space="preserve"> PAGEREF _Toc237591731 \h </w:instrText>
         </w:r>
         <w:r>
           <w:rPr>
@@ -1735,7 +1735,7 @@
           <w14:ligatures w14:val="standardContextual"/>
         </w:rPr>
       </w:pPr>
-      <w:hyperlink w:anchor="_Toc237591191" w:history="1">
+      <w:hyperlink w:anchor="_Toc237591732" w:history="1">
         <w:r>
           <w:rPr>
             <w:rStyle w:val="Hyperlink"/>
@@ -1762,7 +1762,7 @@
             <w:noProof/>
             <w:webHidden/>
           </w:rPr>
-          <w:instrText xml:space="preserve"> PAGEREF _Toc237591191 \h </w:instrText>
+          <w:instrText xml:space="preserve"> PAGEREF _Toc237591732 \h </w:instrText>
         </w:r>
         <w:r>
           <w:rPr>
@@ -1809,7 +1809,7 @@
           <w14:ligatures w14:val="standardContextual"/>
         </w:rPr>
       </w:pPr>
-      <w:hyperlink w:anchor="_Toc237591192" w:history="1">
+      <w:hyperlink w:anchor="_Toc237591733" w:history="1">
         <w:r>
           <w:rPr>
             <w:rStyle w:val="Hyperlink"/>
@@ -1836,7 +1836,7 @@
             <w:noProof/>
             <w:webHidden/>
           </w:rPr>
-          <w:instrText xml:space="preserve"> PAGEREF _Toc237591192 \h </w:instrText>
+          <w:instrText xml:space="preserve"> PAGEREF _Toc237591733 \h </w:instrText>
         </w:r>
         <w:r>
           <w:rPr>
@@ -1883,7 +1883,7 @@
           <w14:ligatures w14:val="standardContextual"/>
         </w:rPr>
       </w:pPr>
-      <w:hyperlink w:anchor="_Toc237591193" w:history="1">
+      <w:hyperlink w:anchor="_Toc237591734" w:history="1">
         <w:r>
           <w:rPr>
             <w:rStyle w:val="Hyperlink"/>
@@ -1910,7 +1910,7 @@
             <w:noProof/>
             <w:webHidden/>
           </w:rPr>
-          <w:instrText xml:space="preserve"> PAGEREF _Toc237591193 \h </w:instrText>
+          <w:instrText xml:space="preserve"> PAGEREF _Toc237591734 \h </w:instrText>
         </w:r>
         <w:r>
           <w:rPr>
@@ -1957,7 +1957,7 @@
           <w14:ligatures w14:val="standardContextual"/>
         </w:rPr>
       </w:pPr>
-      <w:hyperlink w:anchor="_Toc237591194" w:history="1">
+      <w:hyperlink w:anchor="_Toc237591735" w:history="1">
         <w:r>
           <w:rPr>
             <w:rStyle w:val="Hyperlink"/>
@@ -1984,7 +1984,7 @@
             <w:noProof/>
             <w:webHidden/>
           </w:rPr>
-          <w:instrText xml:space="preserve"> PAGEREF _Toc237591194 \h </w:instrText>
+          <w:instrText xml:space="preserve"> PAGEREF _Toc237591735 \h </w:instrText>
         </w:r>
         <w:r>
           <w:rPr>
@@ -2031,7 +2031,7 @@
           <w14:ligatures w14:val="standardContextual"/>
         </w:rPr>
       </w:pPr>
-      <w:hyperlink w:anchor="_Toc237591195" w:history="1">
+      <w:hyperlink w:anchor="_Toc237591736" w:history="1">
         <w:r>
           <w:rPr>
             <w:rStyle w:val="Hyperlink"/>
@@ -2058,7 +2058,7 @@
             <w:noProof/>
             <w:webHidden/>
           </w:rPr>
-          <w:instrText xml:space="preserve"> PAGEREF _Toc237591195 \h </w:instrText>
+          <w:instrText xml:space="preserve"> PAGEREF _Toc237591736 \h </w:instrText>
         </w:r>
         <w:r>
           <w:rPr>
@@ -2105,7 +2105,7 @@
           <w14:ligatures w14:val="standardContextual"/>
         </w:rPr>
       </w:pPr>
-      <w:hyperlink w:anchor="_Toc237591196" w:history="1">
+      <w:hyperlink w:anchor="_Toc237591737" w:history="1">
         <w:r>
           <w:rPr>
             <w:rStyle w:val="Hyperlink"/>
@@ -2132,7 +2132,7 @@
             <w:noProof/>
             <w:webHidden/>
           </w:rPr>
-          <w:instrText xml:space="preserve"> PAGEREF _Toc237591196 \h </w:instrText>
+          <w:instrText xml:space="preserve"> PAGEREF _Toc237591737 \h </w:instrText>
         </w:r>
         <w:r>
           <w:rPr>
@@ -2179,7 +2179,7 @@
           <w14:ligatures w14:val="standardContextual"/>
         </w:rPr>
       </w:pPr>
-      <w:hyperlink w:anchor="_Toc237591197" w:history="1">
+      <w:hyperlink w:anchor="_Toc237591738" w:history="1">
         <w:r>
           <w:rPr>
             <w:rStyle w:val="Hyperlink"/>
@@ -2206,7 +2206,7 @@
             <w:noProof/>
             <w:webHidden/>
           </w:rPr>
-          <w:instrText xml:space="preserve"> PAGEREF _Toc237591197 \h </w:instrText>
+          <w:instrText xml:space="preserve"> PAGEREF _Toc237591738 \h </w:instrText>
         </w:r>
         <w:r>
           <w:rPr>
@@ -2253,7 +2253,7 @@
           <w14:ligatures w14:val="standardContextual"/>
         </w:rPr>
       </w:pPr>
-      <w:hyperlink w:anchor="_Toc237591198" w:history="1">
+      <w:hyperlink w:anchor="_Toc237591739" w:history="1">
         <w:r>
           <w:rPr>
             <w:rStyle w:val="Hyperlink"/>
@@ -2280,7 +2280,7 @@
             <w:noProof/>
             <w:webHidden/>
           </w:rPr>
-          <w:instrText xml:space="preserve"> PAGEREF _Toc237591198 \h </w:instrText>
+          <w:instrText xml:space="preserve"> PAGEREF _Toc237591739 \h </w:instrText>
         </w:r>
         <w:r>
           <w:rPr>
@@ -2327,7 +2327,7 @@
           <w14:ligatures w14:val="standardContextual"/>
         </w:rPr>
       </w:pPr>
-      <w:hyperlink w:anchor="_Toc237591199" w:history="1">
+      <w:hyperlink w:anchor="_Toc237591740" w:history="1">
         <w:r>
           <w:rPr>
             <w:rStyle w:val="Hyperlink"/>
@@ -2354,7 +2354,7 @@
             <w:noProof/>
             <w:webHidden/>
           </w:rPr>
-          <w:instrText xml:space="preserve"> PAGEREF _Toc237591199 \h </w:instrText>
+          <w:instrText xml:space="preserve"> PAGEREF _Toc237591740 \h </w:instrText>
         </w:r>
         <w:r>
           <w:rPr>
@@ -2401,7 +2401,7 @@
           <w14:ligatures w14:val="standardContextual"/>
         </w:rPr>
       </w:pPr>
-      <w:hyperlink w:anchor="_Toc237591200" w:history="1">
+      <w:hyperlink w:anchor="_Toc237591741" w:history="1">
         <w:r>
           <w:rPr>
             <w:rStyle w:val="Hyperlink"/>
@@ -2428,7 +2428,7 @@
             <w:noProof/>
             <w:webHidden/>
           </w:rPr>
-          <w:instrText xml:space="preserve"> PAGEREF _Toc237591200 \h </w:instrText>
+          <w:instrText xml:space="preserve"> PAGEREF _Toc237591741 \h </w:instrText>
         </w:r>
         <w:r>
           <w:rPr>
@@ -2475,7 +2475,7 @@
           <w14:ligatures w14:val="standardContextual"/>
         </w:rPr>
       </w:pPr>
-      <w:hyperlink w:anchor="_Toc237591201" w:history="1">
+      <w:hyperlink w:anchor="_Toc237591742" w:history="1">
         <w:r>
           <w:rPr>
             <w:rStyle w:val="Hyperlink"/>
@@ -2502,7 +2502,7 @@
             <w:noProof/>
             <w:webHidden/>
           </w:rPr>
-          <w:instrText xml:space="preserve"> PAGEREF _Toc237591201 \h </w:instrText>
+          <w:instrText xml:space="preserve"> PAGEREF _Toc237591742 \h </w:instrText>
         </w:r>
         <w:r>
           <w:rPr>
@@ -2549,7 +2549,7 @@
           <w14:ligatures w14:val="standardContextual"/>
         </w:rPr>
       </w:pPr>
-      <w:hyperlink w:anchor="_Toc237591202" w:history="1">
+      <w:hyperlink w:anchor="_Toc237591743" w:history="1">
         <w:r>
           <w:rPr>
             <w:rStyle w:val="Hyperlink"/>
@@ -2576,7 +2576,7 @@
             <w:noProof/>
             <w:webHidden/>
           </w:rPr>
-          <w:instrText xml:space="preserve"> PAGEREF _Toc237591202 \h </w:instrText>
+          <w:instrText xml:space="preserve"> PAGEREF _Toc237591743 \h </w:instrText>
         </w:r>
         <w:r>
           <w:rPr>
@@ -2623,7 +2623,7 @@
           <w14:ligatures w14:val="standardContextual"/>
         </w:rPr>
       </w:pPr>
-      <w:hyperlink w:anchor="_Toc237591203" w:history="1">
+      <w:hyperlink w:anchor="_Toc237591744" w:history="1">
         <w:r>
           <w:rPr>
             <w:rStyle w:val="Hyperlink"/>
@@ -2650,7 +2650,7 @@
             <w:noProof/>
             <w:webHidden/>
           </w:rPr>
-          <w:instrText xml:space="preserve"> PAGEREF _Toc237591203 \h </w:instrText>
+          <w:instrText xml:space="preserve"> PAGEREF _Toc237591744 \h </w:instrText>
         </w:r>
         <w:r>
           <w:rPr>
@@ -2697,7 +2697,7 @@
           <w14:ligatures w14:val="standardContextual"/>
         </w:rPr>
       </w:pPr>
-      <w:hyperlink w:anchor="_Toc237591204" w:history="1">
+      <w:hyperlink w:anchor="_Toc237591745" w:history="1">
         <w:r>
           <w:rPr>
             <w:rStyle w:val="Hyperlink"/>
@@ -2724,7 +2724,7 @@
             <w:noProof/>
             <w:webHidden/>
           </w:rPr>
-          <w:instrText xml:space="preserve"> PAGEREF _Toc237591204 \h </w:instrText>
+          <w:instrText xml:space="preserve"> PAGEREF _Toc237591745 \h </w:instrText>
         </w:r>
         <w:r>
           <w:rPr>
@@ -2771,7 +2771,7 @@
           <w14:ligatures w14:val="standardContextual"/>
         </w:rPr>
       </w:pPr>
-      <w:hyperlink w:anchor="_Toc237591205" w:history="1">
+      <w:hyperlink w:anchor="_Toc237591746" w:history="1">
         <w:r>
           <w:rPr>
             <w:rStyle w:val="Hyperlink"/>
@@ -2798,7 +2798,7 @@
             <w:noProof/>
             <w:webHidden/>
           </w:rPr>
-          <w:instrText xml:space="preserve"> PAGEREF _Toc237591205 \h </w:instrText>
+          <w:instrText xml:space="preserve"> PAGEREF _Toc237591746 \h </w:instrText>
         </w:r>
         <w:r>
           <w:rPr>
@@ -2845,7 +2845,7 @@
           <w14:ligatures w14:val="standardContextual"/>
         </w:rPr>
       </w:pPr>
-      <w:hyperlink w:anchor="_Toc237591206" w:history="1">
+      <w:hyperlink w:anchor="_Toc237591747" w:history="1">
         <w:r>
           <w:rPr>
             <w:rStyle w:val="Hyperlink"/>
@@ -2872,7 +2872,7 @@
             <w:noProof/>
             <w:webHidden/>
           </w:rPr>
-          <w:instrText xml:space="preserve"> PAGEREF _Toc237591206 \h </w:instrText>
+          <w:instrText xml:space="preserve"> PAGEREF _Toc237591747 \h </w:instrText>
         </w:r>
         <w:r>
           <w:rPr>
@@ -2919,7 +2919,7 @@
           <w14:ligatures w14:val="standardContextual"/>
         </w:rPr>
       </w:pPr>
-      <w:hyperlink w:anchor="_Toc237591207" w:history="1">
+      <w:hyperlink w:anchor="_Toc237591748" w:history="1">
         <w:r>
           <w:rPr>
             <w:rStyle w:val="Hyperlink"/>
@@ -2946,7 +2946,7 @@
             <w:noProof/>
             <w:webHidden/>
           </w:rPr>
-          <w:instrText xml:space="preserve"> PAGEREF _Toc237591207 \h </w:instrText>
+          <w:instrText xml:space="preserve"> PAGEREF _Toc237591748 \h </w:instrText>
         </w:r>
         <w:r>
           <w:rPr>
@@ -2993,7 +2993,7 @@
           <w14:ligatures w14:val="standardContextual"/>
         </w:rPr>
       </w:pPr>
-      <w:hyperlink w:anchor="_Toc237591208" w:history="1">
+      <w:hyperlink w:anchor="_Toc237591749" w:history="1">
         <w:r>
           <w:rPr>
             <w:rStyle w:val="Hyperlink"/>
@@ -3020,7 +3020,7 @@
             <w:noProof/>
             <w:webHidden/>
           </w:rPr>
-          <w:instrText xml:space="preserve"> PAGEREF _Toc237591208 \h </w:instrText>
+          <w:instrText xml:space="preserve"> PAGEREF _Toc237591749 \h </w:instrText>
         </w:r>
         <w:r>
           <w:rPr>
@@ -3067,7 +3067,7 @@
           <w14:ligatures w14:val="standardContextual"/>
         </w:rPr>
       </w:pPr>
-      <w:hyperlink w:anchor="_Toc237591209" w:history="1">
+      <w:hyperlink w:anchor="_Toc237591750" w:history="1">
         <w:r>
           <w:rPr>
             <w:rStyle w:val="Hyperlink"/>
@@ -3094,7 +3094,7 @@
             <w:noProof/>
             <w:webHidden/>
           </w:rPr>
-          <w:instrText xml:space="preserve"> PAGEREF _Toc237591209 \h </w:instrText>
+          <w:instrText xml:space="preserve"> PAGEREF _Toc237591750 \h </w:instrText>
         </w:r>
         <w:r>
           <w:rPr>
@@ -3141,7 +3141,7 @@
           <w14:ligatures w14:val="standardContextual"/>
         </w:rPr>
       </w:pPr>
-      <w:hyperlink w:anchor="_Toc237591210" w:history="1">
+      <w:hyperlink w:anchor="_Toc237591751" w:history="1">
         <w:r>
           <w:rPr>
             <w:rStyle w:val="Hyperlink"/>
@@ -3168,7 +3168,7 @@
             <w:noProof/>
             <w:webHidden/>
           </w:rPr>
-          <w:instrText xml:space="preserve"> PAGEREF _Toc237591210 \h </w:instrText>
+          <w:instrText xml:space="preserve"> PAGEREF _Toc237591751 \h </w:instrText>
         </w:r>
         <w:r>
           <w:rPr>
@@ -3215,7 +3215,7 @@
           <w14:ligatures w14:val="standardContextual"/>
         </w:rPr>
       </w:pPr>
-      <w:hyperlink w:anchor="_Toc237591211" w:history="1">
+      <w:hyperlink w:anchor="_Toc237591752" w:history="1">
         <w:r>
           <w:rPr>
             <w:rStyle w:val="Hyperlink"/>
@@ -3242,7 +3242,7 @@
             <w:noProof/>
             <w:webHidden/>
           </w:rPr>
-          <w:instrText xml:space="preserve"> PAGEREF _Toc237591211 \h </w:instrText>
+          <w:instrText xml:space="preserve"> PAGEREF _Toc237591752 \h </w:instrText>
         </w:r>
         <w:r>
           <w:rPr>
@@ -3289,7 +3289,7 @@
           <w14:ligatures w14:val="standardContextual"/>
         </w:rPr>
       </w:pPr>
-      <w:hyperlink w:anchor="_Toc237591212" w:history="1">
+      <w:hyperlink w:anchor="_Toc237591753" w:history="1">
         <w:r>
           <w:rPr>
             <w:rStyle w:val="Hyperlink"/>
@@ -3316,7 +3316,7 @@
             <w:noProof/>
             <w:webHidden/>
           </w:rPr>
-          <w:instrText xml:space="preserve"> PAGEREF _Toc237591212 \h </w:instrText>
+          <w:instrText xml:space="preserve"> PAGEREF _Toc237591753 \h </w:instrText>
         </w:r>
         <w:r>
           <w:rPr>
@@ -3363,7 +3363,7 @@
           <w14:ligatures w14:val="standardContextual"/>
         </w:rPr>
       </w:pPr>
-      <w:hyperlink w:anchor="_Toc237591213" w:history="1">
+      <w:hyperlink w:anchor="_Toc237591754" w:history="1">
         <w:r>
           <w:rPr>
             <w:rStyle w:val="Hyperlink"/>
@@ -3390,7 +3390,7 @@
             <w:noProof/>
             <w:webHidden/>
           </w:rPr>
-          <w:instrText xml:space="preserve"> PAGEREF _Toc237591213 \h </w:instrText>
+          <w:instrText xml:space="preserve"> PAGEREF _Toc237591754 \h </w:instrText>
         </w:r>
         <w:r>
           <w:rPr>
@@ -3437,7 +3437,7 @@
           <w14:ligatures w14:val="standardContextual"/>
         </w:rPr>
       </w:pPr>
-      <w:hyperlink w:anchor="_Toc237591214" w:history="1">
+      <w:hyperlink w:anchor="_Toc237591755" w:history="1">
         <w:r>
           <w:rPr>
             <w:rStyle w:val="Hyperlink"/>
@@ -3464,7 +3464,7 @@
             <w:noProof/>
             <w:webHidden/>
           </w:rPr>
-          <w:instrText xml:space="preserve"> PAGEREF _Toc237591214 \h </w:instrText>
+          <w:instrText xml:space="preserve"> PAGEREF _Toc237591755 \h </w:instrText>
         </w:r>
         <w:r>
           <w:rPr>
@@ -3511,7 +3511,7 @@
           <w14:ligatures w14:val="standardContextual"/>
         </w:rPr>
       </w:pPr>
-      <w:hyperlink w:anchor="_Toc237591215" w:history="1">
+      <w:hyperlink w:anchor="_Toc237591756" w:history="1">
         <w:r>
           <w:rPr>
             <w:rStyle w:val="Hyperlink"/>
@@ -3538,7 +3538,7 @@
             <w:noProof/>
             <w:webHidden/>
           </w:rPr>
-          <w:instrText xml:space="preserve"> PAGEREF _Toc237591215 \h </w:instrText>
+          <w:instrText xml:space="preserve"> PAGEREF _Toc237591756 \h </w:instrText>
         </w:r>
         <w:r>
           <w:rPr>
@@ -3585,7 +3585,7 @@
           <w14:ligatures w14:val="standardContextual"/>
         </w:rPr>
       </w:pPr>
-      <w:hyperlink w:anchor="_Toc237591216" w:history="1">
+      <w:hyperlink w:anchor="_Toc237591757" w:history="1">
         <w:r>
           <w:rPr>
             <w:rStyle w:val="Hyperlink"/>
@@ -3612,7 +3612,7 @@
             <w:noProof/>
             <w:webHidden/>
           </w:rPr>
-          <w:instrText xml:space="preserve"> PAGEREF _Toc237591216 \h </w:instrText>
+          <w:instrText xml:space="preserve"> PAGEREF _Toc237591757 \h </w:instrText>
         </w:r>
         <w:r>
           <w:rPr>
@@ -3659,7 +3659,7 @@
           <w14:ligatures w14:val="standardContextual"/>
         </w:rPr>
       </w:pPr>
-      <w:hyperlink w:anchor="_Toc237591217" w:history="1">
+      <w:hyperlink w:anchor="_Toc237591758" w:history="1">
         <w:r>
           <w:rPr>
             <w:rStyle w:val="Hyperlink"/>
@@ -3686,7 +3686,7 @@
             <w:noProof/>
             <w:webHidden/>
           </w:rPr>
-          <w:instrText xml:space="preserve"> PAGEREF _Toc237591217 \h </w:instrText>
+          <w:instrText xml:space="preserve"> PAGEREF _Toc237591758 \h </w:instrText>
         </w:r>
         <w:r>
           <w:rPr>
@@ -3733,7 +3733,7 @@
           <w14:ligatures w14:val="standardContextual"/>
         </w:rPr>
       </w:pPr>
-      <w:hyperlink w:anchor="_Toc237591218" w:history="1">
+      <w:hyperlink w:anchor="_Toc237591759" w:history="1">
         <w:r>
           <w:rPr>
             <w:rStyle w:val="Hyperlink"/>
@@ -3760,7 +3760,7 @@
             <w:noProof/>
             <w:webHidden/>
           </w:rPr>
-          <w:instrText xml:space="preserve"> PAGEREF _Toc237591218 \h </w:instrText>
+          <w:instrText xml:space="preserve"> PAGEREF _Toc237591759 \h </w:instrText>
         </w:r>
         <w:r>
           <w:rPr>
@@ -3807,7 +3807,7 @@
           <w14:ligatures w14:val="standardContextual"/>
         </w:rPr>
       </w:pPr>
-      <w:hyperlink w:anchor="_Toc237591219" w:history="1">
+      <w:hyperlink w:anchor="_Toc237591760" w:history="1">
         <w:r>
           <w:rPr>
             <w:rStyle w:val="Hyperlink"/>
@@ -3834,7 +3834,7 @@
             <w:noProof/>
             <w:webHidden/>
           </w:rPr>
-          <w:instrText xml:space="preserve"> PAGEREF _Toc237591219 \h </w:instrText>
+          <w:instrText xml:space="preserve"> PAGEREF _Toc237591760 \h </w:instrText>
         </w:r>
         <w:r>
           <w:rPr>
@@ -3879,7 +3879,7 @@
       <w:pPr>
         <w:pStyle w:val="Heading2"/>
       </w:pPr>
-      <w:bookmarkStart w:id="1" w:name="_Toc237591174"/>
+      <w:bookmarkStart w:id="1" w:name="_Toc237591715"/>
       <w:r>
         <w:lastRenderedPageBreak/>
         <w:t>Quy ư</w:t>
@@ -4949,7 +4949,7 @@
       <w:pPr>
         <w:pStyle w:val="Heading1"/>
       </w:pPr>
-      <w:bookmarkStart w:id="2" w:name="_Toc237591175"/>
+      <w:bookmarkStart w:id="2" w:name="_Toc237591716"/>
       <w:r>
         <w:t>Tóm t</w:t>
       </w:r>
@@ -5906,7 +5906,7 @@
           <w:color w:val="1F4D78"/>
           <w:sz w:val="18"/>
         </w:rPr>
-        <w:t>257/257</w:t>
+        <w:t>258/258</w:t>
       </w:r>
       <w:r>
         <w:t>. Focused fault/session đ</w:t>
@@ -6046,7 +6046,7 @@
       <w:pPr>
         <w:pStyle w:val="Heading1"/>
       </w:pPr>
-      <w:bookmarkStart w:id="3" w:name="_Toc237591176"/>
+      <w:bookmarkStart w:id="3" w:name="_Toc237591717"/>
       <w:r>
         <w:t>1. Đ</w:t>
       </w:r>
@@ -6071,7 +6071,7 @@
       <w:pPr>
         <w:pStyle w:val="Heading2"/>
       </w:pPr>
-      <w:bookmarkStart w:id="4" w:name="_Toc237591177"/>
+      <w:bookmarkStart w:id="4" w:name="_Toc237591718"/>
       <w:r>
         <w:t>1.1. B</w:t>
       </w:r>
@@ -6415,7 +6415,7 @@
       <w:pPr>
         <w:pStyle w:val="Heading2"/>
       </w:pPr>
-      <w:bookmarkStart w:id="5" w:name="_Toc237591178"/>
+      <w:bookmarkStart w:id="5" w:name="_Toc237591719"/>
       <w:r>
         <w:t>1.2. M</w:t>
       </w:r>
@@ -6616,7 +6616,7 @@
       <w:pPr>
         <w:pStyle w:val="Heading2"/>
       </w:pPr>
-      <w:bookmarkStart w:id="6" w:name="_Toc237591179"/>
+      <w:bookmarkStart w:id="6" w:name="_Toc237591720"/>
       <w:r>
         <w:lastRenderedPageBreak/>
         <w:t>1.3. Phù h</w:t>
@@ -7453,7 +7453,7 @@
       <w:pPr>
         <w:pStyle w:val="Heading2"/>
       </w:pPr>
-      <w:bookmarkStart w:id="7" w:name="_Toc237591180"/>
+      <w:bookmarkStart w:id="7" w:name="_Toc237591721"/>
       <w:r>
         <w:t>1.4. Đóng góp m</w:t>
       </w:r>
@@ -7675,7 +7675,7 @@
         <w:pStyle w:val="Heading1"/>
         <w:pageBreakBefore/>
       </w:pPr>
-      <w:bookmarkStart w:id="8" w:name="_Toc237591181"/>
+      <w:bookmarkStart w:id="8" w:name="_Toc237591722"/>
       <w:r>
         <w:lastRenderedPageBreak/>
         <w:t>2. N</w:t>
@@ -7722,7 +7722,7 @@
       <w:pPr>
         <w:pStyle w:val="Heading2"/>
       </w:pPr>
-      <w:bookmarkStart w:id="9" w:name="_Toc237591182"/>
+      <w:bookmarkStart w:id="9" w:name="_Toc237591723"/>
       <w:r>
         <w:t>2.1. MQTT 3.1.1</w:t>
       </w:r>
@@ -8156,7 +8156,7 @@
       <w:pPr>
         <w:pStyle w:val="Heading2"/>
       </w:pPr>
-      <w:bookmarkStart w:id="10" w:name="_Toc237591183"/>
+      <w:bookmarkStart w:id="10" w:name="_Toc237591724"/>
       <w:r>
         <w:t>2.2. Edge và ranh gi</w:t>
       </w:r>
@@ -8467,7 +8467,7 @@
       <w:pPr>
         <w:pStyle w:val="Heading2"/>
       </w:pPr>
-      <w:bookmarkStart w:id="11" w:name="_Toc237591184"/>
+      <w:bookmarkStart w:id="11" w:name="_Toc237591725"/>
       <w:r>
         <w:t>2.3. 5G ch</w:t>
       </w:r>
@@ -8715,7 +8715,7 @@
       <w:pPr>
         <w:pStyle w:val="Heading2"/>
       </w:pPr>
-      <w:bookmarkStart w:id="12" w:name="_Toc237591185"/>
+      <w:bookmarkStart w:id="12" w:name="_Toc237591726"/>
       <w:r>
         <w:lastRenderedPageBreak/>
         <w:t>2.4. Measurement boundary và RFC 9341</w:t>
@@ -8900,7 +8900,7 @@
         <w:pStyle w:val="Heading1"/>
         <w:pageBreakBefore/>
       </w:pPr>
-      <w:bookmarkStart w:id="13" w:name="_Toc237591186"/>
+      <w:bookmarkStart w:id="13" w:name="_Toc237591727"/>
       <w:r>
         <w:lastRenderedPageBreak/>
         <w:t>3. Baseline h</w:t>
@@ -8923,7 +8923,7 @@
       <w:pPr>
         <w:pStyle w:val="Heading2"/>
       </w:pPr>
-      <w:bookmarkStart w:id="14" w:name="_Toc237591187"/>
+      <w:bookmarkStart w:id="14" w:name="_Toc237591728"/>
       <w:r>
         <w:t>3.1. Ki</w:t>
       </w:r>
@@ -9150,7 +9150,7 @@
       <w:pPr>
         <w:pStyle w:val="Heading2"/>
       </w:pPr>
-      <w:bookmarkStart w:id="15" w:name="_Toc237591188"/>
+      <w:bookmarkStart w:id="15" w:name="_Toc237591729"/>
       <w:r>
         <w:t>3.2. Topic và contract</w:t>
       </w:r>
@@ -9679,7 +9679,7 @@
       <w:pPr>
         <w:pStyle w:val="Heading2"/>
       </w:pPr>
-      <w:bookmarkStart w:id="16" w:name="_Toc237591189"/>
+      <w:bookmarkStart w:id="16" w:name="_Toc237591730"/>
       <w:r>
         <w:t>3.3. Baseline nghiên c</w:t>
       </w:r>
@@ -10129,7 +10129,7 @@
         <w:pStyle w:val="Heading1"/>
         <w:pageBreakBefore/>
       </w:pPr>
-      <w:bookmarkStart w:id="17" w:name="_Toc237591190"/>
+      <w:bookmarkStart w:id="17" w:name="_Toc237591731"/>
       <w:r>
         <w:lastRenderedPageBreak/>
         <w:t>4. Câu h</w:t>
@@ -10152,7 +10152,7 @@
       <w:pPr>
         <w:pStyle w:val="Heading2"/>
       </w:pPr>
-      <w:bookmarkStart w:id="18" w:name="_Toc237591191"/>
+      <w:bookmarkStart w:id="18" w:name="_Toc237591732"/>
       <w:r>
         <w:t>4.1. RQ1 - atomic/session-aware processing</w:t>
       </w:r>
@@ -10365,7 +10365,7 @@
       <w:pPr>
         <w:pStyle w:val="Heading2"/>
       </w:pPr>
-      <w:bookmarkStart w:id="19" w:name="_Toc237591192"/>
+      <w:bookmarkStart w:id="19" w:name="_Toc237591733"/>
       <w:r>
         <w:t>4.2. RQ2 - app impairment phía simulator</w:t>
       </w:r>
@@ -10508,7 +10508,7 @@
         <w:pStyle w:val="Heading1"/>
         <w:pageBreakBefore/>
       </w:pPr>
-      <w:bookmarkStart w:id="20" w:name="_Toc237591193"/>
+      <w:bookmarkStart w:id="20" w:name="_Toc237591734"/>
       <w:r>
         <w:lastRenderedPageBreak/>
         <w:t>5. Thi</w:t>
@@ -10537,7 +10537,7 @@
       <w:pPr>
         <w:pStyle w:val="Heading2"/>
       </w:pPr>
-      <w:bookmarkStart w:id="21" w:name="_Toc237591194"/>
+      <w:bookmarkStart w:id="21" w:name="_Toc237591735"/>
       <w:r>
         <w:t>5.1. Factor, control và sampling unit</w:t>
       </w:r>
@@ -10909,7 +10909,7 @@
       <w:pPr>
         <w:pStyle w:val="Heading2"/>
       </w:pPr>
-      <w:bookmarkStart w:id="22" w:name="_Toc237591195"/>
+      <w:bookmarkStart w:id="22" w:name="_Toc237591736"/>
       <w:r>
         <w:t>5.2. Fault matrix RQ1</w:t>
       </w:r>
@@ -11651,7 +11651,7 @@
       <w:pPr>
         <w:pStyle w:val="Heading2"/>
       </w:pPr>
-      <w:bookmarkStart w:id="23" w:name="_Toc237591196"/>
+      <w:bookmarkStart w:id="23" w:name="_Toc237591737"/>
       <w:r>
         <w:t>5.3. Profile RQ2</w:t>
       </w:r>
@@ -12170,7 +12170,7 @@
       <w:pPr>
         <w:pStyle w:val="Heading2"/>
       </w:pPr>
-      <w:bookmarkStart w:id="24" w:name="_Toc237591197"/>
+      <w:bookmarkStart w:id="24" w:name="_Toc237591738"/>
       <w:r>
         <w:t>5.4. KPI và denominator</w:t>
       </w:r>
@@ -12699,7 +12699,7 @@
       <w:pPr>
         <w:pStyle w:val="Heading2"/>
       </w:pPr>
-      <w:bookmarkStart w:id="25" w:name="_Toc237591198"/>
+      <w:bookmarkStart w:id="25" w:name="_Toc237591739"/>
       <w:r>
         <w:t>5.5. Runner và evidence</w:t>
       </w:r>
@@ -13061,7 +13061,7 @@
       <w:pPr>
         <w:pStyle w:val="Heading2"/>
       </w:pPr>
-      <w:bookmarkStart w:id="26" w:name="_Toc237591199"/>
+      <w:bookmarkStart w:id="26" w:name="_Toc237591740"/>
       <w:r>
         <w:t>5.6. R</w:t>
       </w:r>
@@ -13398,7 +13398,7 @@
         <w:pStyle w:val="Heading1"/>
         <w:pageBreakBefore/>
       </w:pPr>
-      <w:bookmarkStart w:id="27" w:name="_Toc237591200"/>
+      <w:bookmarkStart w:id="27" w:name="_Toc237591741"/>
       <w:r>
         <w:lastRenderedPageBreak/>
         <w:t>6. Thi</w:t>
@@ -13427,7 +13427,7 @@
       <w:pPr>
         <w:pStyle w:val="Heading2"/>
       </w:pPr>
-      <w:bookmarkStart w:id="28" w:name="_Toc237591201"/>
+      <w:bookmarkStart w:id="28" w:name="_Toc237591742"/>
       <w:r>
         <w:t>6.1. Atomic ingestion</w:t>
       </w:r>
@@ -13577,7 +13577,7 @@
       <w:pPr>
         <w:pStyle w:val="Heading2"/>
       </w:pPr>
-      <w:bookmarkStart w:id="29" w:name="_Toc237591202"/>
+      <w:bookmarkStart w:id="29" w:name="_Toc237591743"/>
       <w:r>
         <w:t>6.2. Session policy</w:t>
       </w:r>
@@ -14218,7 +14218,7 @@
       <w:pPr>
         <w:pStyle w:val="Heading2"/>
       </w:pPr>
-      <w:bookmarkStart w:id="30" w:name="_Toc237591203"/>
+      <w:bookmarkStart w:id="30" w:name="_Toc237591744"/>
       <w:r>
         <w:lastRenderedPageBreak/>
         <w:t>6.3. Experiment cockpit</w:t>
@@ -14235,7 +14235,7 @@
           <w:noProof/>
         </w:rPr>
         <w:drawing>
-          <wp:inline distT="0" distB="0" distL="0" distR="0" wp14:anchorId="5A8D84B1" wp14:editId="0228696C">
+          <wp:inline distT="0" distB="0" distL="0" distR="0" wp14:anchorId="40018B1B" wp14:editId="16425D9B">
             <wp:extent cx="5623560" cy="5229130"/>
             <wp:effectExtent l="0" t="0" r="0" b="0"/>
             <wp:docPr id="3" name="Picture 3" descr="Dashboard tối với trạng thái Edge, node cảm biến, evidence run và KPI độ tin cậy MQTT."/>
@@ -14443,7 +14443,7 @@
         <w:pStyle w:val="Heading1"/>
         <w:pageBreakBefore/>
       </w:pPr>
-      <w:bookmarkStart w:id="31" w:name="_Toc237591204"/>
+      <w:bookmarkStart w:id="31" w:name="_Toc237591745"/>
       <w:r>
         <w:lastRenderedPageBreak/>
         <w:t>7. K</w:t>
@@ -14463,7 +14463,7 @@
       <w:pPr>
         <w:pStyle w:val="Heading2"/>
       </w:pPr>
-      <w:bookmarkStart w:id="32" w:name="_Toc237591205"/>
+      <w:bookmarkStart w:id="32" w:name="_Toc237591746"/>
       <w:r>
         <w:t>7.1. Ph</w:t>
       </w:r>
@@ -14779,7 +14779,7 @@
       <w:pPr>
         <w:pStyle w:val="Heading2"/>
       </w:pPr>
-      <w:bookmarkStart w:id="33" w:name="_Toc237591206"/>
+      <w:bookmarkStart w:id="33" w:name="_Toc237591747"/>
       <w:r>
         <w:t>7.2. K</w:t>
       </w:r>
@@ -15464,7 +15464,7 @@
           <w:noProof/>
         </w:rPr>
         <w:drawing>
-          <wp:inline distT="0" distB="0" distL="0" distR="0" wp14:anchorId="63611605" wp14:editId="1E96AA18">
+          <wp:inline distT="0" distB="0" distL="0" distR="0" wp14:anchorId="0B0DD223" wp14:editId="2C433F7D">
             <wp:extent cx="5623560" cy="3022664"/>
             <wp:effectExtent l="0" t="0" r="0" b="0"/>
             <wp:docPr id="4" name="Picture 4" descr="Biểu đồ cho thấy baseline đạt 0 trên 30, bản hardened đạt 30 trên 30 cho atomic alert và old LWT session."/>
@@ -15589,7 +15589,7 @@
           <w:color w:val="1F4D78"/>
           <w:sz w:val="18"/>
         </w:rPr>
-        <w:t>257 passed</w:t>
+        <w:t>258 passed</w:t>
       </w:r>
       <w:r>
         <w:t>. Tuy nhiên, chúng không có A/B artifact l</w:t>
@@ -15882,7 +15882,7 @@
       <w:pPr>
         <w:pStyle w:val="Heading2"/>
       </w:pPr>
-      <w:bookmarkStart w:id="34" w:name="_Toc237591207"/>
+      <w:bookmarkStart w:id="34" w:name="_Toc237591748"/>
       <w:r>
         <w:lastRenderedPageBreak/>
         <w:t>7.3. K</w:t>
@@ -16690,7 +16690,7 @@
           <w:noProof/>
         </w:rPr>
         <w:drawing>
-          <wp:inline distT="0" distB="0" distL="0" distR="0" wp14:anchorId="150810E5" wp14:editId="717CE12D">
+          <wp:inline distT="0" distB="0" distL="0" distR="0" wp14:anchorId="2AE76FC9" wp14:editId="0BB82F8A">
             <wp:extent cx="5623560" cy="3444430"/>
             <wp:effectExtent l="0" t="0" r="0" b="0"/>
             <wp:docPr id="5" name="Picture 5" descr="Biểu đồ tỷ lệ API quan sát trên toàn bộ lịch phát cùng p50 và p95 schedule-to-API polling upper-bound cho LAN baseline và nhiễu tầng ứng dụng."/>
@@ -17814,7 +17814,7 @@
       <w:pPr>
         <w:pStyle w:val="Heading2"/>
       </w:pPr>
-      <w:bookmarkStart w:id="35" w:name="_Toc237591208"/>
+      <w:bookmarkStart w:id="35" w:name="_Toc237591749"/>
       <w:r>
         <w:t>7.4. Validation ledger</w:t>
       </w:r>
@@ -18306,7 +18306,7 @@
               <w:rPr>
                 <w:sz w:val="17"/>
               </w:rPr>
-              <w:t>evidence/analysis/verification-latest.json, artifact 1.3, SHA-256 9e82fe7fa3848812eb18fc0491f01fc250ac71032beb4e94c8d61f55e8eb0c69; exact invocation .\scripts\VERIFY-MVP.ps1 -IncludeDockerLive -IncludeFirmware; commit_clean t</w:t>
+              <w:t>evidence/analysis/verification-latest.json, artifact 1.3, SHA-256 826a42b26a8d407f13fc6f691cc7305d1d96c305cf9b5c5354e3d63c252d28e8; exact invocation .\scripts\VERIFY-MVP.ps1 -IncludeDockerLive -IncludeFirmware; commit_clean t</w:t>
             </w:r>
             <w:r>
               <w:rPr>
@@ -18318,7 +18318,7 @@
               <w:rPr>
                 <w:sz w:val="17"/>
               </w:rPr>
-              <w:t>i 935c393e03a68465e538f624ff3405cd4560eb49; portable verification-input SHA-256 df8660c0e5ff35364bab282e4cd6f6fb9c684682921df8ebd383f7b1acbea413</w:t>
+              <w:t>i ee0c2331e3aebdf8d08f6200c4f2b351d6f0893b; portable verification-input SHA-256 96d0c29637fdd0cfbb4398d36df9653577845ecb89a03aedc8843f48c94d6395</w:t>
             </w:r>
           </w:p>
         </w:tc>
@@ -18398,7 +18398,7 @@
               <w:rPr>
                 <w:sz w:val="17"/>
               </w:rPr>
-              <w:t>257 passed</w:t>
+              <w:t>258 passed</w:t>
             </w:r>
           </w:p>
         </w:tc>
@@ -19176,7 +19176,7 @@
               <w:rPr>
                 <w:sz w:val="17"/>
               </w:rPr>
-              <w:t>evidence/final/nt532-mqtt-mvp-evidence-v5.zip, SHA-256 def22cfdfbaf36acdd651bec0639ecda83e9f4cc20ea8cb69c00cc28aa60093f; 189 file allowlist, aggregate tái tính kh</w:t>
+              <w:t>evidence/final/nt532-mqtt-mvp-evidence-v5.zip, SHA-256 52aa1960e98209560a61fe9c835a98d47e46f95a5e8780bc365a6a993e083daa; 189 file allowlist, aggregate tái tính kh</w:t>
             </w:r>
             <w:r>
               <w:rPr>
@@ -19290,7 +19290,7 @@
               <w:rPr>
                 <w:sz w:val="17"/>
               </w:rPr>
-              <w:t>evidence/final/nt532-software-e2e-acceptance.zip, SHA-256 da9c4a8d21ab40cd5e99c793973d77c775b570305d3f57d9ab6a57b780e7fe3a; đúng 14 payload allowlist, 10 text file redaction pass; tách riêng đ</w:t>
+              <w:t>evidence/final/nt532-software-e2e-acceptance.zip, SHA-256 b6dc2e9016d97fecdb8394b653fc0dbee0eba2cd1073b099f3cf8dceff984542; đúng 14 payload allowlist, 10 text file redaction pass; tách riêng đ</w:t>
             </w:r>
             <w:r>
               <w:rPr>
@@ -19727,7 +19727,7 @@
         <w:pStyle w:val="Heading1"/>
         <w:pageBreakBefore/>
       </w:pPr>
-      <w:bookmarkStart w:id="36" w:name="_Toc237591209"/>
+      <w:bookmarkStart w:id="36" w:name="_Toc237591750"/>
       <w:r>
         <w:lastRenderedPageBreak/>
         <w:t>8. K</w:t>
@@ -20249,7 +20249,7 @@
         <w:pStyle w:val="Heading1"/>
         <w:pageBreakBefore/>
       </w:pPr>
-      <w:bookmarkStart w:id="37" w:name="_Toc237591210"/>
+      <w:bookmarkStart w:id="37" w:name="_Toc237591751"/>
       <w:r>
         <w:lastRenderedPageBreak/>
         <w:t>9. Th</w:t>
@@ -20694,7 +20694,7 @@
         <w:pStyle w:val="Heading1"/>
         <w:pageBreakBefore/>
       </w:pPr>
-      <w:bookmarkStart w:id="38" w:name="_Toc237591211"/>
+      <w:bookmarkStart w:id="38" w:name="_Toc237591752"/>
       <w:r>
         <w:lastRenderedPageBreak/>
         <w:t>10. L</w:t>
@@ -20738,7 +20738,7 @@
       <w:pPr>
         <w:pStyle w:val="Heading2"/>
       </w:pPr>
-      <w:bookmarkStart w:id="39" w:name="_Toc237591212"/>
+      <w:bookmarkStart w:id="39" w:name="_Toc237591753"/>
       <w:r>
         <w:t>10.1. Hoàn t</w:t>
       </w:r>
@@ -20946,7 +20946,7 @@
       <w:pPr>
         <w:pStyle w:val="Heading2"/>
       </w:pPr>
-      <w:bookmarkStart w:id="40" w:name="_Toc237591213"/>
+      <w:bookmarkStart w:id="40" w:name="_Toc237591754"/>
       <w:r>
         <w:t>10.2. Hardening s</w:t>
       </w:r>
@@ -21106,7 +21106,7 @@
       <w:pPr>
         <w:pStyle w:val="Heading2"/>
       </w:pPr>
-      <w:bookmarkStart w:id="41" w:name="_Toc237591214"/>
+      <w:bookmarkStart w:id="41" w:name="_Toc237591755"/>
       <w:r>
         <w:t>10.3. Validation backhaul 5G tương lai</w:t>
       </w:r>
@@ -21475,7 +21475,7 @@
         <w:pStyle w:val="Heading1"/>
         <w:pageBreakBefore/>
       </w:pPr>
-      <w:bookmarkStart w:id="42" w:name="_Toc237591215"/>
+      <w:bookmarkStart w:id="42" w:name="_Toc237591756"/>
       <w:r>
         <w:lastRenderedPageBreak/>
         <w:t>11. K</w:t>
@@ -21634,7 +21634,7 @@
           <w:color w:val="1F4D78"/>
           <w:sz w:val="18"/>
         </w:rPr>
-        <w:t>257 passed</w:t>
+        <w:t>258 passed</w:t>
       </w:r>
       <w:r>
         <w:t>. RQ2 v5 hoàn thành 30 c</w:t>
@@ -22018,7 +22018,7 @@
         <w:pStyle w:val="Heading1"/>
         <w:pageBreakBefore/>
       </w:pPr>
-      <w:bookmarkStart w:id="43" w:name="_Toc237591216"/>
+      <w:bookmarkStart w:id="43" w:name="_Toc237591757"/>
       <w:r>
         <w:lastRenderedPageBreak/>
         <w:t>Tài li</w:t>
@@ -22480,7 +22480,7 @@
         <w:pStyle w:val="Heading1"/>
         <w:pageBreakBefore/>
       </w:pPr>
-      <w:bookmarkStart w:id="44" w:name="_Toc237591217"/>
+      <w:bookmarkStart w:id="44" w:name="_Toc237591758"/>
       <w:r>
         <w:lastRenderedPageBreak/>
         <w:t>Ph</w:t>
@@ -22621,7 +22621,7 @@
       <w:pPr>
         <w:pStyle w:val="Heading1"/>
       </w:pPr>
-      <w:bookmarkStart w:id="45" w:name="_Toc237591218"/>
+      <w:bookmarkStart w:id="45" w:name="_Toc237591759"/>
       <w:r>
         <w:lastRenderedPageBreak/>
         <w:t>Ph</w:t>
@@ -24151,7 +24151,7 @@
               <w:rPr>
                 <w:sz w:val="13"/>
               </w:rPr>
-              <w:t>evidence/final/nt532-mqtt-mvp-evidence-v5.zip, SHA-256 def22cfdfbaf36acdd651bec0639ecda83e9f4cc20ea8cb69c00cc28aa60093f</w:t>
+              <w:t>evidence/final/nt532-mqtt-mvp-evidence-v5.zip, SHA-256 52aa1960e98209560a61fe9c835a98d47e46f95a5e8780bc365a6a993e083daa</w:t>
             </w:r>
           </w:p>
         </w:tc>
@@ -24303,7 +24303,7 @@
               <w:rPr>
                 <w:sz w:val="13"/>
               </w:rPr>
-              <w:t>evidence/final/nt532-software-e2e-acceptance.zip, SHA-256 da9c4a8d21ab40cd5e99c793973d77c775b570305d3f57d9ab6a57b780e7fe3a</w:t>
+              <w:t>evidence/final/nt532-software-e2e-acceptance.zip, SHA-256 b6dc2e9016d97fecdb8394b653fc0dbee0eba2cd1073b099f3cf8dceff984542</w:t>
             </w:r>
           </w:p>
         </w:tc>
@@ -24559,7 +24559,7 @@
         <w:pStyle w:val="Heading1"/>
         <w:pageBreakBefore/>
       </w:pPr>
-      <w:bookmarkStart w:id="46" w:name="_Toc237591219"/>
+      <w:bookmarkStart w:id="46" w:name="_Toc237591760"/>
       <w:r>
         <w:lastRenderedPageBreak/>
         <w:t>Ph</w:t>
@@ -25777,9 +25777,9 @@
     </w:lvl>
   </w:abstractNum>
   <w:abstractNum w:abstractNumId="9" w15:restartNumberingAfterBreak="0">
-    <w:nsid w:val="147E55F0"/>
+    <w:nsid w:val="04EE5F96"/>
     <w:multiLevelType w:val="singleLevel"/>
-    <w:tmpl w:val="54BAF034"/>
+    <w:tmpl w:val="9E72FE54"/>
     <w:lvl w:ilvl="0">
       <w:start w:val="1"/>
       <w:numFmt w:val="decimal"/>
@@ -25794,13 +25794,13 @@
     </w:lvl>
   </w:abstractNum>
   <w:abstractNum w:abstractNumId="10" w15:restartNumberingAfterBreak="0">
-    <w:nsid w:val="149C6202"/>
+    <w:nsid w:val="18AB1865"/>
     <w:multiLevelType w:val="singleLevel"/>
-    <w:tmpl w:val="749AD834"/>
+    <w:tmpl w:val="2EFCDC86"/>
     <w:lvl w:ilvl="0">
       <w:start w:val="1"/>
-      <w:numFmt w:val="bullet"/>
-      <w:lvlText w:val="•"/>
+      <w:numFmt w:val="decimal"/>
+      <w:lvlText w:val="%1."/>
       <w:lvlJc w:val="left"/>
       <w:pPr>
         <w:tabs>
@@ -25811,9 +25811,9 @@
     </w:lvl>
   </w:abstractNum>
   <w:abstractNum w:abstractNumId="11" w15:restartNumberingAfterBreak="0">
-    <w:nsid w:val="30D76ED5"/>
+    <w:nsid w:val="386E1CD5"/>
     <w:multiLevelType w:val="singleLevel"/>
-    <w:tmpl w:val="417C9820"/>
+    <w:tmpl w:val="9D1844F6"/>
     <w:lvl w:ilvl="0">
       <w:start w:val="1"/>
       <w:numFmt w:val="decimal"/>
@@ -25828,9 +25828,9 @@
     </w:lvl>
   </w:abstractNum>
   <w:abstractNum w:abstractNumId="12" w15:restartNumberingAfterBreak="0">
-    <w:nsid w:val="58B6076F"/>
+    <w:nsid w:val="4DC53A7A"/>
     <w:multiLevelType w:val="singleLevel"/>
-    <w:tmpl w:val="A5E01E0E"/>
+    <w:tmpl w:val="45B25336"/>
     <w:lvl w:ilvl="0">
       <w:start w:val="1"/>
       <w:numFmt w:val="decimal"/>
@@ -25845,9 +25845,26 @@
     </w:lvl>
   </w:abstractNum>
   <w:abstractNum w:abstractNumId="13" w15:restartNumberingAfterBreak="0">
-    <w:nsid w:val="6E4D5B04"/>
+    <w:nsid w:val="4E072F86"/>
     <w:multiLevelType w:val="singleLevel"/>
-    <w:tmpl w:val="C69255F0"/>
+    <w:tmpl w:val="AEDCE166"/>
+    <w:lvl w:ilvl="0">
+      <w:start w:val="1"/>
+      <w:numFmt w:val="bullet"/>
+      <w:lvlText w:val="•"/>
+      <w:lvlJc w:val="left"/>
+      <w:pPr>
+        <w:tabs>
+          <w:tab w:val="num" w:pos="540"/>
+        </w:tabs>
+        <w:ind w:left="540" w:hanging="279"/>
+      </w:pPr>
+    </w:lvl>
+  </w:abstractNum>
+  <w:abstractNum w:abstractNumId="14" w15:restartNumberingAfterBreak="0">
+    <w:nsid w:val="6DC565BB"/>
+    <w:multiLevelType w:val="singleLevel"/>
+    <w:tmpl w:val="F272903C"/>
     <w:lvl w:ilvl="0">
       <w:start w:val="1"/>
       <w:numFmt w:val="decimal"/>
@@ -25861,66 +25878,49 @@
       </w:pPr>
     </w:lvl>
   </w:abstractNum>
-  <w:abstractNum w:abstractNumId="14" w15:restartNumberingAfterBreak="0">
-    <w:nsid w:val="720044F0"/>
-    <w:multiLevelType w:val="singleLevel"/>
-    <w:tmpl w:val="BC0EE906"/>
-    <w:lvl w:ilvl="0">
-      <w:start w:val="1"/>
-      <w:numFmt w:val="decimal"/>
-      <w:lvlText w:val="%1."/>
-      <w:lvlJc w:val="left"/>
-      <w:pPr>
-        <w:tabs>
-          <w:tab w:val="num" w:pos="540"/>
-        </w:tabs>
-        <w:ind w:left="540" w:hanging="279"/>
-      </w:pPr>
-    </w:lvl>
-  </w:abstractNum>
-  <w:num w:numId="1" w16cid:durableId="83235712">
+  <w:num w:numId="1" w16cid:durableId="86080554">
     <w:abstractNumId w:val="8"/>
   </w:num>
-  <w:num w:numId="2" w16cid:durableId="449596796">
+  <w:num w:numId="2" w16cid:durableId="2025160554">
     <w:abstractNumId w:val="6"/>
   </w:num>
-  <w:num w:numId="3" w16cid:durableId="1300184167">
+  <w:num w:numId="3" w16cid:durableId="1232080973">
     <w:abstractNumId w:val="5"/>
   </w:num>
-  <w:num w:numId="4" w16cid:durableId="1362703568">
+  <w:num w:numId="4" w16cid:durableId="1903102744">
     <w:abstractNumId w:val="4"/>
   </w:num>
-  <w:num w:numId="5" w16cid:durableId="1259562305">
+  <w:num w:numId="5" w16cid:durableId="282806599">
     <w:abstractNumId w:val="7"/>
   </w:num>
-  <w:num w:numId="6" w16cid:durableId="891306594">
+  <w:num w:numId="6" w16cid:durableId="344483776">
     <w:abstractNumId w:val="3"/>
   </w:num>
-  <w:num w:numId="7" w16cid:durableId="1510020674">
+  <w:num w:numId="7" w16cid:durableId="1067609957">
     <w:abstractNumId w:val="2"/>
   </w:num>
-  <w:num w:numId="8" w16cid:durableId="1346706152">
+  <w:num w:numId="8" w16cid:durableId="1494564654">
     <w:abstractNumId w:val="1"/>
   </w:num>
-  <w:num w:numId="9" w16cid:durableId="458769077">
+  <w:num w:numId="9" w16cid:durableId="1786729932">
     <w:abstractNumId w:val="0"/>
   </w:num>
-  <w:num w:numId="10" w16cid:durableId="1467747044">
+  <w:num w:numId="10" w16cid:durableId="955528339">
+    <w:abstractNumId w:val="13"/>
+  </w:num>
+  <w:num w:numId="11" w16cid:durableId="157772317">
     <w:abstractNumId w:val="10"/>
   </w:num>
-  <w:num w:numId="11" w16cid:durableId="705954403">
+  <w:num w:numId="12" w16cid:durableId="403919798">
     <w:abstractNumId w:val="12"/>
   </w:num>
-  <w:num w:numId="12" w16cid:durableId="264584173">
-    <w:abstractNumId w:val="13"/>
+  <w:num w:numId="13" w16cid:durableId="1710497572">
+    <w:abstractNumId w:val="11"/>
   </w:num>
-  <w:num w:numId="13" w16cid:durableId="286544634">
+  <w:num w:numId="14" w16cid:durableId="1226525040">
     <w:abstractNumId w:val="14"/>
   </w:num>
-  <w:num w:numId="14" w16cid:durableId="218782935">
-    <w:abstractNumId w:val="11"/>
-  </w:num>
-  <w:num w:numId="15" w16cid:durableId="1821337534">
+  <w:num w:numId="15" w16cid:durableId="250478658">
     <w:abstractNumId w:val="9"/>
   </w:num>
 </w:numbering>
@@ -37333,7 +37333,7 @@
     <w:autoRedefine/>
     <w:uiPriority w:val="39"/>
     <w:unhideWhenUsed/>
-    <w:rsid w:val="00DE4D69"/>
+    <w:rsid w:val="00906F86"/>
     <w:pPr>
       <w:spacing w:after="100"/>
     </w:pPr>
@@ -37345,7 +37345,7 @@
     <w:autoRedefine/>
     <w:uiPriority w:val="39"/>
     <w:unhideWhenUsed/>
-    <w:rsid w:val="00DE4D69"/>
+    <w:rsid w:val="00906F86"/>
     <w:pPr>
       <w:spacing w:after="100"/>
       <w:ind w:left="220"/>
@@ -37356,7 +37356,7 @@
     <w:basedOn w:val="DefaultParagraphFont"/>
     <w:uiPriority w:val="99"/>
     <w:unhideWhenUsed/>
-    <w:rsid w:val="00DE4D69"/>
+    <w:rsid w:val="00906F86"/>
     <w:rPr>
       <w:color w:val="0000FF" w:themeColor="hyperlink"/>
       <w:u w:val="single"/>

</xml_diff>